<commit_message>
feat: complete Valencia PowerWatch with 5-10min video limit and Render deployment config
</commit_message>
<xml_diff>
--- a/Valencia_PowerWatch_Proposal_Presentation_Guide.docx
+++ b/Valencia_PowerWatch_Proposal_Presentation_Guide.docx
@@ -319,7 +319,19 @@
 </w:t>
       </w:r>
       <w:r>
-        <w:t xml:space="preserve">• Offline Report Queue: Kung mapalong ang cellular signal panahon sa bagyo, i-save sa app ang report ug awtomatikong i-upload inig balik sa signal.
+        <w:t xml:space="preserve">• Dual Language Switcher (English ⇄ Sinugbuanong Binisaya): 1-click language switcher sa taas nga header para sa lokal nga pagsabot.
+</w:t>
+      </w:r>
+      <w:r>
+        <w:t xml:space="preserve">• Automated ETR Engine: Makita sa report detalye ang gibanabana nga oras sa pagbalik sa kuryente (ETR) ug ang automated explanation.
+</w:t>
+      </w:r>
+      <w:r>
+        <w:t xml:space="preserve">• Citizen Feedback &amp; 5-Star Rating: Post-restoration confirmation ug star rating aron masiguro nga tinuod nga nisiga na ang balay.
+</w:t>
+      </w:r>
+      <w:r>
+        <w:t xml:space="preserve">• Offline Report Queue: Kung mapalong ang cellular signal, i-save sa app ang report ug awtomatikong i-upload inig balik sa signal.
 </w:t>
       </w:r>
       <w:r>
@@ -349,6 +361,18 @@
       </w:r>
       <w:r>
         <w:t xml:space="preserve">• GIS Heatmap &amp; Smart Clustering: Makit-an sa mapa kung asa nagtapok ang mga brownout aron mahibal-an dayon kung tibuok feeder o transformer ang naguba.
+</w:t>
+      </w:r>
+      <w:r>
+        <w:t xml:space="preserve">• Automated ETR Calculator: Awtomatikong modugang og safety buffer time (30%–50%) base sa kahimtang sa panahon (ulan, kilat) sa Valencia.
+</w:t>
+      </w:r>
+      <w:r>
+        <w:t xml:space="preserve">• SMS Gateway Monitor &amp; Live Dispatcher: Semaphore API integration nga may test broadcast button ug transmission logs.
+</w:t>
+      </w:r>
+      <w:r>
+        <w:t xml:space="preserve">• Citizen Satisfaction Analytics: Real-time visual cards sa average rating (4.8/5.0 ⭐), power confirmation rate, ug mga testimonya.
 </w:t>
       </w:r>
       <w:r>
@@ -605,6 +629,60 @@
       </w:r>
       <w:r>
         <w:t xml:space="preserve">Gitipigan ang tanang impormasyon sa usa ka Centralized Database gamit ang SQLite/Relational Database nga may session security ug access restrictions tali sa Admin ug Residente.</w:t>
+      </w:r>
+    </w:p>
+    <w:p>
+      <w:pPr>
+        <w:pStyle w:val="Heading1"/>
+        <w:spacing w:after="120" w:before="240"/>
+      </w:pPr>
+      <w:r>
+        <w:t xml:space="preserve">10. Official Sample Data &amp; Dynamic System Integration</w:t>
+      </w:r>
+    </w:p>
+    <w:p>
+      <w:pPr>
+        <w:spacing w:after="240"/>
+      </w:pPr>
+      <w:r>
+        <w:rPr>
+          <w:b/>
+          <w:bCs/>
+        </w:rPr>
+        <w:t xml:space="preserve">A. Designated Preloaded / Sample Baseline Accounts:
+</w:t>
+      </w:r>
+      <w:r>
+        <w:t xml:space="preserve">1. Delmarkel Saro-ay (Administrator)
+   • Username/Email: DELMARKEL2003
+   • Password: ADMIN2023*
+   • Role: Administrator (Permanent, fixed &amp; protected credentials)
+</w:t>
+      </w:r>
+      <w:r>
+        <w:t xml:space="preserve">2. Armiralyn Suello (Sample Resident)
+   • Email: suelloalmiralyn@gmail.com
+   • Password: user123*
+   • Barangay: Poblacion
+</w:t>
+      </w:r>
+      <w:r>
+        <w:t xml:space="preserve">3. Lui Gie Aguimbag (Sample Resident)
+   • Email: luigie.aguimbag@gmail.com
+   • Password: user123*
+   • Barangay: Bagontaas
+</w:t>
+      </w:r>
+      <w:r>
+        <w:rPr>
+          <w:b/>
+          <w:bCs/>
+        </w:rPr>
+        <w:t xml:space="preserve">B. Dynamic Registration &amp; Real-Time Sync:
+</w:t>
+      </w:r>
+      <w:r>
+        <w:t xml:space="preserve">Kung adunay bag-ong residente nga mag-register sa User Portal (/community), awtomatiko kining i-rekord sa database, i-forward sa Admin Portal (/admin), ug mag-trigger og real-time notification sa Admin. Ang matag report, status update, ug satisfaction feedback gikan sa bag-ong user awtomatikong mag-reflect sa tibuok sistema.</w:t>
       </w:r>
     </w:p>
     <w:sectPr>

</xml_diff>